<commit_message>
Limitations and future work
</commit_message>
<xml_diff>
--- a/R00065426_(John)_Paul_Nagle_NLP_Assignment_1.docx
+++ b/R00065426_(John)_Paul_Nagle_NLP_Assignment_1.docx
@@ -1094,7 +1094,13 @@
     </w:p>
     <w:p>
       <w:r>
-        <w:t>The python notebook was run in Google colab using a H100 GPU&gt; I implemented a fal</w:t>
+        <w:t>The python notebook was run in Google colab using a H100 GPU</w:t>
+      </w:r>
+      <w:r>
+        <w:t>.</w:t>
+      </w:r>
+      <w:r>
+        <w:t xml:space="preserve"> I implemented a fal</w:t>
       </w:r>
       <w:r>
         <w:t>l</w:t>
@@ -1117,11 +1123,9 @@
       <w:r>
         <w:t xml:space="preserve">code could still be tested and debugged on a computer that </w:t>
       </w:r>
-      <w:proofErr w:type="gramStart"/>
-      <w:r>
-        <w:t>wasn’t capable of running</w:t>
-      </w:r>
-      <w:proofErr w:type="gramEnd"/>
+      <w:r>
+        <w:t>couldn’t run</w:t>
+      </w:r>
       <w:r>
         <w:t xml:space="preserve"> the larger 7B models.</w:t>
       </w:r>
@@ -6770,23 +6774,34 @@
     </w:p>
     <w:p>
       <w:r>
-        <w:t xml:space="preserve">This is the section for talking about limitations and </w:t>
-      </w:r>
-      <w:r>
-        <w:t>future</w:t>
-      </w:r>
-      <w:r>
-        <w:t xml:space="preserve"> work</w:t>
-      </w:r>
-    </w:p>
-    <w:p>
-      <w:r>
-        <w:t>Persona based prompting</w:t>
-      </w:r>
-    </w:p>
-    <w:p>
-      <w:r>
-        <w:t>Quantisation/</w:t>
+        <w:t>Limitations: As can be seen from the failure analysis section, many of the answers that were deemed to be incorrect, were in fact versions of the correct answers with nuanced changes. Ideally, all the answers would have been reviewed by a person knowledgeable in the area. Obviously, this would have been a large undertaking, as there were many questions, but I feel that the failure rate could have been mitigated with this approach. Conversely, all the correct answers would need to be double checked as well.</w:t>
+      </w:r>
+    </w:p>
+    <w:p>
+      <w:r>
+        <w:t>The persona-based</w:t>
+      </w:r>
+      <w:r>
+        <w:t xml:space="preserve"> prompting</w:t>
+      </w:r>
+      <w:r>
+        <w:t xml:space="preserve"> that I implemented seemed to me to be a very naïve approach. Simply, telling the LLM that it was an expert in the area does not necessarily make the LLM an expert in the area. A better approach might have been RAG based, where detailed correct information in the form of data files would have been fed to the LLM to provide it with accurate information upon which to base </w:t>
+      </w:r>
+      <w:proofErr w:type="gramStart"/>
+      <w:r>
+        <w:t>it’s</w:t>
+      </w:r>
+      <w:proofErr w:type="gramEnd"/>
+      <w:r>
+        <w:t xml:space="preserve"> answers. The potential issue here would be that we would be spoon feeding answers to the LLM and thus biasing the results, so a degree of caution would have been needed.</w:t>
+      </w:r>
+    </w:p>
+    <w:p>
+      <w:r>
+        <w:t>I attempted to implement some q</w:t>
+      </w:r>
+      <w:r>
+        <w:t>uantisation/</w:t>
       </w:r>
       <w:proofErr w:type="spellStart"/>
       <w:r>
@@ -6796,10 +6811,247 @@
       <w:r>
         <w:t xml:space="preserve"> usage optimisation</w:t>
       </w:r>
-    </w:p>
-    <w:p>
-      <w:r>
-        <w:t>Confidence estimation with temperature not equal to zero</w:t>
+      <w:r>
+        <w:t xml:space="preserve"> as part of the code by including the following quantisation settings:</w:t>
+      </w:r>
+    </w:p>
+    <w:p>
+      <w:pPr>
+        <w:spacing w:line="120" w:lineRule="exact"/>
+        <w:rPr>
+          <w:rStyle w:val="FixedWidthText"/>
+          <w:sz w:val="16"/>
+          <w:szCs w:val="16"/>
+        </w:rPr>
+      </w:pPr>
+      <w:r>
+        <w:rPr>
+          <w:rStyle w:val="FixedWidthText"/>
+          <w:sz w:val="16"/>
+          <w:szCs w:val="16"/>
+        </w:rPr>
+        <w:t xml:space="preserve">    # GPU: Use 4-bit quantization</w:t>
+      </w:r>
+    </w:p>
+    <w:p>
+      <w:pPr>
+        <w:spacing w:line="120" w:lineRule="exact"/>
+        <w:rPr>
+          <w:rStyle w:val="FixedWidthText"/>
+          <w:sz w:val="16"/>
+          <w:szCs w:val="16"/>
+        </w:rPr>
+      </w:pPr>
+      <w:r>
+        <w:rPr>
+          <w:rStyle w:val="FixedWidthText"/>
+          <w:sz w:val="16"/>
+          <w:szCs w:val="16"/>
+        </w:rPr>
+        <w:t xml:space="preserve">    </w:t>
+      </w:r>
+      <w:proofErr w:type="spellStart"/>
+      <w:r>
+        <w:rPr>
+          <w:rStyle w:val="FixedWidthText"/>
+          <w:sz w:val="16"/>
+          <w:szCs w:val="16"/>
+        </w:rPr>
+        <w:t>quantization_config</w:t>
+      </w:r>
+      <w:proofErr w:type="spellEnd"/>
+      <w:r>
+        <w:rPr>
+          <w:rStyle w:val="FixedWidthText"/>
+          <w:sz w:val="16"/>
+          <w:szCs w:val="16"/>
+        </w:rPr>
+        <w:t xml:space="preserve"> = </w:t>
+      </w:r>
+      <w:proofErr w:type="spellStart"/>
+      <w:proofErr w:type="gramStart"/>
+      <w:r>
+        <w:rPr>
+          <w:rStyle w:val="FixedWidthText"/>
+          <w:sz w:val="16"/>
+          <w:szCs w:val="16"/>
+        </w:rPr>
+        <w:t>BitsAndBytesConfig</w:t>
+      </w:r>
+      <w:proofErr w:type="spellEnd"/>
+      <w:r>
+        <w:rPr>
+          <w:rStyle w:val="FixedWidthText"/>
+          <w:sz w:val="16"/>
+          <w:szCs w:val="16"/>
+        </w:rPr>
+        <w:t>(</w:t>
+      </w:r>
+      <w:proofErr w:type="gramEnd"/>
+    </w:p>
+    <w:p>
+      <w:pPr>
+        <w:spacing w:line="120" w:lineRule="exact"/>
+        <w:rPr>
+          <w:rStyle w:val="FixedWidthText"/>
+          <w:sz w:val="16"/>
+          <w:szCs w:val="16"/>
+        </w:rPr>
+      </w:pPr>
+      <w:r>
+        <w:rPr>
+          <w:rStyle w:val="FixedWidthText"/>
+          <w:sz w:val="16"/>
+          <w:szCs w:val="16"/>
+        </w:rPr>
+        <w:t xml:space="preserve">        load_in_4bit=True,</w:t>
+      </w:r>
+    </w:p>
+    <w:p>
+      <w:pPr>
+        <w:spacing w:line="120" w:lineRule="exact"/>
+        <w:rPr>
+          <w:rStyle w:val="FixedWidthText"/>
+          <w:sz w:val="16"/>
+          <w:szCs w:val="16"/>
+        </w:rPr>
+      </w:pPr>
+      <w:r>
+        <w:rPr>
+          <w:rStyle w:val="FixedWidthText"/>
+          <w:sz w:val="16"/>
+          <w:szCs w:val="16"/>
+        </w:rPr>
+        <w:t xml:space="preserve">        bnb_4bit_compute_dtype=</w:t>
+      </w:r>
+      <w:proofErr w:type="gramStart"/>
+      <w:r>
+        <w:rPr>
+          <w:rStyle w:val="FixedWidthText"/>
+          <w:sz w:val="16"/>
+          <w:szCs w:val="16"/>
+        </w:rPr>
+        <w:t>torch.float</w:t>
+      </w:r>
+      <w:proofErr w:type="gramEnd"/>
+      <w:r>
+        <w:rPr>
+          <w:rStyle w:val="FixedWidthText"/>
+          <w:sz w:val="16"/>
+          <w:szCs w:val="16"/>
+        </w:rPr>
+        <w:t>16,</w:t>
+      </w:r>
+    </w:p>
+    <w:p>
+      <w:pPr>
+        <w:spacing w:line="120" w:lineRule="exact"/>
+        <w:rPr>
+          <w:rStyle w:val="FixedWidthText"/>
+          <w:sz w:val="16"/>
+          <w:szCs w:val="16"/>
+        </w:rPr>
+      </w:pPr>
+      <w:r>
+        <w:rPr>
+          <w:rStyle w:val="FixedWidthText"/>
+          <w:sz w:val="16"/>
+          <w:szCs w:val="16"/>
+        </w:rPr>
+        <w:t xml:space="preserve">        bnb_4bit_quant_type="nf4",</w:t>
+      </w:r>
+    </w:p>
+    <w:p>
+      <w:pPr>
+        <w:spacing w:line="120" w:lineRule="exact"/>
+        <w:rPr>
+          <w:rStyle w:val="FixedWidthText"/>
+          <w:sz w:val="16"/>
+          <w:szCs w:val="16"/>
+        </w:rPr>
+      </w:pPr>
+      <w:r>
+        <w:rPr>
+          <w:rStyle w:val="FixedWidthText"/>
+          <w:sz w:val="16"/>
+          <w:szCs w:val="16"/>
+        </w:rPr>
+        <w:t xml:space="preserve">        bnb_4bit_use_double_quant=True,</w:t>
+      </w:r>
+    </w:p>
+    <w:p>
+      <w:pPr>
+        <w:spacing w:line="120" w:lineRule="exact"/>
+        <w:rPr>
+          <w:rStyle w:val="FixedWidthText"/>
+          <w:sz w:val="16"/>
+          <w:szCs w:val="16"/>
+        </w:rPr>
+      </w:pPr>
+      <w:r>
+        <w:rPr>
+          <w:rStyle w:val="FixedWidthText"/>
+          <w:sz w:val="16"/>
+          <w:szCs w:val="16"/>
+        </w:rPr>
+        <w:t xml:space="preserve">    )</w:t>
+      </w:r>
+    </w:p>
+    <w:p>
+      <w:r>
+        <w:t xml:space="preserve">The settings that I chose in practise reduced the amount of RAM that the GPU used to 16GB. I did not have the time to experiment with other </w:t>
+      </w:r>
+      <w:r>
+        <w:t>settings. It may we</w:t>
+      </w:r>
+      <w:r>
+        <w:t>l</w:t>
+      </w:r>
+      <w:r>
+        <w:t xml:space="preserve">l be possible that I could have improved </w:t>
+      </w:r>
+      <w:r>
+        <w:t>throughput</w:t>
+      </w:r>
+      <w:r>
+        <w:t xml:space="preserve"> by adjusting these settings </w:t>
+      </w:r>
+      <w:r>
+        <w:t xml:space="preserve">for the </w:t>
+      </w:r>
+      <w:proofErr w:type="gramStart"/>
+      <w:r>
+        <w:t>particular GPU</w:t>
+      </w:r>
+      <w:proofErr w:type="gramEnd"/>
+      <w:r>
+        <w:t xml:space="preserve"> that I used in </w:t>
+      </w:r>
+      <w:proofErr w:type="spellStart"/>
+      <w:r>
+        <w:t>colab</w:t>
+      </w:r>
+      <w:proofErr w:type="spellEnd"/>
+      <w:r>
+        <w:t>. The H100 GPU had 64 GB of ram, but only 16GB were used in the run.  Potentially there might have been scope to run 4 separate threads of execution through the GPU, reducing the processing time by a factor of 4.</w:t>
+      </w:r>
+    </w:p>
+    <w:p/>
+    <w:p>
+      <w:r>
+        <w:t>The c</w:t>
+      </w:r>
+      <w:r>
+        <w:t xml:space="preserve">onfidence estimation with temperature </w:t>
+      </w:r>
+      <w:r>
+        <w:t xml:space="preserve">set to </w:t>
+      </w:r>
+      <w:r>
+        <w:t>zero</w:t>
+      </w:r>
+      <w:r>
+        <w:t xml:space="preserve"> seemed to be problematic. Temperature of zero always meant that the LLM returned the most probable token and skewed the confidence estimation. I would have liked more time to investigate other methods of confidence estimation, ones that potentially did not rely on what the LLM reported back.</w:t>
       </w:r>
     </w:p>
     <w:p>
@@ -7067,13 +7319,7 @@
           <w:rPr>
             <w:rStyle w:val="Hyperlink"/>
           </w:rPr>
-          <w:t>https://www.microsoft.com/en-us/corporate-responsibility/topics/ai-economy-</w:t>
-        </w:r>
-        <w:r>
-          <w:rPr>
-            <w:rStyle w:val="Hyperlink"/>
-          </w:rPr>
-          <w:t>institute/reports/global-ai-adoption-2025/</w:t>
+          <w:t>https://www.microsoft.com/en-us/corporate-responsibility/topics/ai-economy-institute/reports/global-ai-adoption-2025/</w:t>
         </w:r>
       </w:hyperlink>
     </w:p>
@@ -11717,10 +11963,6 @@
 </file>
 
 <file path=customXml/item1.xml><?xml version="1.0" encoding="utf-8"?>
-<b:Sources xmlns:b="http://schemas.openxmlformats.org/officeDocument/2006/bibliography" xmlns="http://schemas.openxmlformats.org/officeDocument/2006/bibliography" SelectedStyle="\APASixthEditionOfficeOnline.xsl" StyleName="APA" Version="6"/>
-</file>
-
-<file path=customXml/item2.xml><?xml version="1.0" encoding="utf-8"?>
 <ct:contentTypeSchema xmlns:ct="http://schemas.microsoft.com/office/2006/metadata/contentType" xmlns:ma="http://schemas.microsoft.com/office/2006/metadata/properties/metaAttributes" ct:_="" ma:_="" ma:contentTypeName="Document" ma:contentTypeID="0x01010078195E5A655B1F419BEA189A3A95C299" ma:contentTypeVersion="10" ma:contentTypeDescription="Crée un document." ma:contentTypeScope="" ma:versionID="2565b4d261c143ebfe75fd259b6bcd59">
   <xsd:schema xmlns:xsd="http://www.w3.org/2001/XMLSchema" xmlns:xs="http://www.w3.org/2001/XMLSchema" xmlns:p="http://schemas.microsoft.com/office/2006/metadata/properties" xmlns:ns2="62f7326d-23c9-4c29-8c57-4f24d8722e7e" xmlns:ns3="22c202fc-011b-4e26-8c44-f2cfa4c279bc" targetNamespace="http://schemas.microsoft.com/office/2006/metadata/properties" ma:root="true" ma:fieldsID="d72157d5b0c62b9f9755a627728cfd03" ns2:_="" ns3:_="">
     <xsd:import namespace="62f7326d-23c9-4c29-8c57-4f24d8722e7e"/>
@@ -11909,16 +12151,11 @@
 </ct:contentTypeSchema>
 </file>
 
-<file path=customXml/item3.xml><?xml version="1.0" encoding="utf-8"?>
-<?mso-contentType ?>
-<FormTemplates xmlns="http://schemas.microsoft.com/sharepoint/v3/contenttype/forms">
-  <Display>DocumentLibraryForm</Display>
-  <Edit>DocumentLibraryForm</Edit>
-  <New>DocumentLibraryForm</New>
-</FormTemplates>
+<file path=customXml/item2.xml><?xml version="1.0" encoding="utf-8"?>
+<b:Sources xmlns:b="http://schemas.openxmlformats.org/officeDocument/2006/bibliography" xmlns="http://schemas.openxmlformats.org/officeDocument/2006/bibliography" SelectedStyle="\APASixthEditionOfficeOnline.xsl" StyleName="APA" Version="6"/>
 </file>
 
-<file path=customXml/item4.xml><?xml version="1.0" encoding="utf-8"?>
+<file path=customXml/item3.xml><?xml version="1.0" encoding="utf-8"?>
 <p:properties xmlns:p="http://schemas.microsoft.com/office/2006/metadata/properties" xmlns:xsi="http://www.w3.org/2001/XMLSchema-instance" xmlns:pc="http://schemas.microsoft.com/office/infopath/2007/PartnerControls">
   <documentManagement>
     <TaxCatchAll xmlns="22c202fc-011b-4e26-8c44-f2cfa4c279bc" xsi:nil="true"/>
@@ -11929,15 +12166,16 @@
 </p:properties>
 </file>
 
-<file path=customXml/itemProps1.xml><?xml version="1.0" encoding="utf-8"?>
-<ds:datastoreItem xmlns:ds="http://schemas.openxmlformats.org/officeDocument/2006/customXml" ds:itemID="{55619DD0-44FF-45CC-A1AA-11DEFCB71573}">
-  <ds:schemaRefs>
-    <ds:schemaRef ds:uri="http://schemas.openxmlformats.org/officeDocument/2006/bibliography"/>
-  </ds:schemaRefs>
-</ds:datastoreItem>
+<file path=customXml/item4.xml><?xml version="1.0" encoding="utf-8"?>
+<?mso-contentType ?>
+<FormTemplates xmlns="http://schemas.microsoft.com/sharepoint/v3/contenttype/forms">
+  <Display>DocumentLibraryForm</Display>
+  <Edit>DocumentLibraryForm</Edit>
+  <New>DocumentLibraryForm</New>
+</FormTemplates>
 </file>
 
-<file path=customXml/itemProps2.xml><?xml version="1.0" encoding="utf-8"?>
+<file path=customXml/itemProps1.xml><?xml version="1.0" encoding="utf-8"?>
 <ds:datastoreItem xmlns:ds="http://schemas.openxmlformats.org/officeDocument/2006/customXml" ds:itemID="{CF2E338C-B3A7-4820-B3AF-6468A979A60E}">
   <ds:schemaRefs>
     <ds:schemaRef ds:uri="http://schemas.microsoft.com/office/2006/metadata/contentType"/>
@@ -11956,15 +12194,15 @@
 </ds:datastoreItem>
 </file>
 
-<file path=customXml/itemProps3.xml><?xml version="1.0" encoding="utf-8"?>
-<ds:datastoreItem xmlns:ds="http://schemas.openxmlformats.org/officeDocument/2006/customXml" ds:itemID="{534D3452-20BD-4AA2-9FDF-9A4B15CAE6F5}">
+<file path=customXml/itemProps2.xml><?xml version="1.0" encoding="utf-8"?>
+<ds:datastoreItem xmlns:ds="http://schemas.openxmlformats.org/officeDocument/2006/customXml" ds:itemID="{55619DD0-44FF-45CC-A1AA-11DEFCB71573}">
   <ds:schemaRefs>
-    <ds:schemaRef ds:uri="http://schemas.microsoft.com/sharepoint/v3/contenttype/forms"/>
+    <ds:schemaRef ds:uri="http://schemas.openxmlformats.org/officeDocument/2006/bibliography"/>
   </ds:schemaRefs>
 </ds:datastoreItem>
 </file>
 
-<file path=customXml/itemProps4.xml><?xml version="1.0" encoding="utf-8"?>
+<file path=customXml/itemProps3.xml><?xml version="1.0" encoding="utf-8"?>
 <ds:datastoreItem xmlns:ds="http://schemas.openxmlformats.org/officeDocument/2006/customXml" ds:itemID="{D9C12D68-2805-4693-88ED-D456E27B80A9}">
   <ds:schemaRefs>
     <ds:schemaRef ds:uri="http://schemas.microsoft.com/office/2006/metadata/properties"/>
@@ -11973,4 +12211,12 @@
     <ds:schemaRef ds:uri="62f7326d-23c9-4c29-8c57-4f24d8722e7e"/>
   </ds:schemaRefs>
 </ds:datastoreItem>
+</file>
+
+<file path=customXml/itemProps4.xml><?xml version="1.0" encoding="utf-8"?>
+<ds:datastoreItem xmlns:ds="http://schemas.openxmlformats.org/officeDocument/2006/customXml" ds:itemID="{534D3452-20BD-4AA2-9FDF-9A4B15CAE6F5}">
+  <ds:schemaRefs>
+    <ds:schemaRef ds:uri="http://schemas.microsoft.com/sharepoint/v3/contenttype/forms"/>
+  </ds:schemaRefs>
+</ds:datastoreItem>
 </file>
</xml_diff>

<commit_message>
Colab sharable link in the doc
</commit_message>
<xml_diff>
--- a/R00065426_(John)_Paul_Nagle_NLP_Assignment_1.docx
+++ b/R00065426_(John)_Paul_Nagle_NLP_Assignment_1.docx
@@ -254,11 +254,6 @@
       </w:r>
     </w:p>
     <w:p>
-      <w:pPr>
-        <w:rPr>
-          <w:lang w:eastAsia="fr-FR"/>
-        </w:rPr>
-      </w:pPr>
       <w:hyperlink r:id="rId11" w:history="1">
         <w:r>
           <w:rPr>
@@ -269,6 +264,43 @@
         </w:r>
       </w:hyperlink>
     </w:p>
+    <w:p/>
+    <w:p>
+      <w:r>
+        <w:t xml:space="preserve">The file in </w:t>
+      </w:r>
+      <w:proofErr w:type="spellStart"/>
+      <w:r>
+        <w:t>colab</w:t>
+      </w:r>
+      <w:proofErr w:type="spellEnd"/>
+      <w:r>
+        <w:t xml:space="preserve"> can be found at this link</w:t>
+      </w:r>
+    </w:p>
+    <w:p>
+      <w:pPr>
+        <w:rPr>
+          <w:lang w:eastAsia="fr-FR"/>
+        </w:rPr>
+      </w:pPr>
+      <w:hyperlink r:id="rId12" w:history="1">
+        <w:r>
+          <w:rPr>
+            <w:rStyle w:val="Hyperlink"/>
+            <w:lang w:eastAsia="fr-FR"/>
+          </w:rPr>
+          <w:t>https://colab.research.google.com/drive/1t-kJR_2uix8BBmIfqSTX_dqXt4E1ZsQ9?usp=sharing</w:t>
+        </w:r>
+      </w:hyperlink>
+    </w:p>
+    <w:p>
+      <w:pPr>
+        <w:rPr>
+          <w:lang w:eastAsia="fr-FR"/>
+        </w:rPr>
+      </w:pPr>
+    </w:p>
     <w:p>
       <w:pPr>
         <w:rPr>
@@ -303,7 +335,7 @@
         </w:rPr>
         <w:t xml:space="preserve">I re-used some the datasets from </w:t>
       </w:r>
-      <w:hyperlink r:id="rId12" w:history="1">
+      <w:hyperlink r:id="rId13" w:history="1">
         <w:r>
           <w:rPr>
             <w:rStyle w:val="Hyperlink"/>
@@ -360,7 +392,13 @@
         <w:rPr>
           <w:lang w:eastAsia="fr-FR"/>
         </w:rPr>
-        <w:t xml:space="preserve"> at</w:t>
+        <w:t xml:space="preserve"> </w:t>
+      </w:r>
+      <w:r>
+        <w:rPr>
+          <w:lang w:eastAsia="fr-FR"/>
+        </w:rPr>
+        <w:t>at</w:t>
       </w:r>
       <w:r>
         <w:rPr>
@@ -589,7 +627,11 @@
     </w:p>
     <w:p>
       <w:r>
-        <w:t>Answers were generated with Temperature set to 0 for reproducibility, and all answers returned a token probability from the LLM which was used to calculate an overall confidence score for the questions. An abstention method was implemented which would discard any answer with a confidence score lower than 0.3, but none were encountered. Confidence scores were values i.e. between 0.0 and 1.0</w:t>
+        <w:t xml:space="preserve">Answers were generated with Temperature set to 0 for reproducibility, and all answers returned a token probability from the LLM which was used to calculate an overall confidence score for the questions. An abstention method was implemented which would discard any answer </w:t>
+      </w:r>
+      <w:r>
+        <w:lastRenderedPageBreak/>
+        <w:t>with a confidence score lower than 0.3, but none were encountered. Confidence scores were values i.e. between 0.0 and 1.0</w:t>
       </w:r>
     </w:p>
     <w:p>
@@ -599,7 +641,6 @@
     </w:p>
     <w:p>
       <w:r>
-        <w:lastRenderedPageBreak/>
         <w:t>I then calculated some metrics, accuracy, confidence analysis i.e. confidence gap between correct and incorrect answers</w:t>
       </w:r>
       <w:r>
@@ -997,13 +1038,7 @@
         <w:rPr>
           <w:lang w:val="en-US"/>
         </w:rPr>
-        <w:t xml:space="preserve">. Ethiopian script is called </w:t>
-      </w:r>
-      <w:r>
-        <w:rPr>
-          <w:lang w:val="en-US"/>
-        </w:rPr>
-        <w:t>Amharic and is a low resource language, even though there are close to 60 million native speakers. I ran the methods provided by the library to standardize the characters, clean punctuation spacing (Amharic uses unique punctuation marks</w:t>
+        <w:t>. Ethiopian script is called Amharic and is a low resource language, even though there are close to 60 million native speakers. I ran the methods provided by the library to standardize the characters, clean punctuation spacing (Amharic uses unique punctuation marks</w:t>
       </w:r>
       <w:r>
         <w:rPr>
@@ -1287,7 +1322,11 @@
       </w:r>
       <w:proofErr w:type="spellEnd"/>
       <w:r>
-        <w:t xml:space="preserve"> functionality to obtain the selected token’s probability and I was able to average these to calculate the overall probability for each token. The final confidence score was then the arithmetic mean of </w:t>
+        <w:t xml:space="preserve"> functionality to obtain the selected token’s </w:t>
+      </w:r>
+      <w:r>
+        <w:lastRenderedPageBreak/>
+        <w:t xml:space="preserve">probability and I was able to average these to calculate the overall probability for each token. The final confidence score was then the arithmetic mean of </w:t>
       </w:r>
       <w:r>
         <w:t>all</w:t>
@@ -1307,11 +1346,7 @@
         <w:t xml:space="preserve"> useful for analysis. i.e. </w:t>
       </w:r>
       <w:r>
-        <w:t xml:space="preserve">Average confidence (all), Average confidence (correct), Average confidence (incorrect), </w:t>
-      </w:r>
-      <w:r>
-        <w:lastRenderedPageBreak/>
-        <w:t>Confidence gap, Abstention rate, Coverage, Precision on answered</w:t>
+        <w:t>Average confidence (all), Average confidence (correct), Average confidence (incorrect), Confidence gap, Abstention rate, Coverage, Precision on answered</w:t>
       </w:r>
       <w:r>
         <w:t>.</w:t>
@@ -1612,7 +1647,10 @@
       </w:r>
       <w:proofErr w:type="gramEnd"/>
       <w:r>
-        <w:t xml:space="preserve"> the languages tested. In comparison with the MCQ results (detailed later) on approximately the same topics, but asked in the native language, there is a huge difference. Questions asked about Ethiopian culture and traditions. are answered much better when they are asked in English.</w:t>
+        <w:t xml:space="preserve"> the languages tested. In comparison with the MCQ results (detailed later) on approximately the same topics, but asked in the native language, there is a huge difference. Questions asked about Ethiopian culture and </w:t>
+      </w:r>
+      <w:r>
+        <w:t>traditions. are answered much better when they are asked in English.</w:t>
       </w:r>
     </w:p>
     <w:p/>
@@ -2724,7 +2762,14 @@
         <w:rPr>
           <w:lang w:val="en-US"/>
         </w:rPr>
-        <w:t xml:space="preserve"> There was very little difference in the confidence levels between the correct answers and the incorrect answers. This leads us to believe that the Large Language Model had no real idea if the information that it was presenting was correct or incorrect. It was blindly confident about </w:t>
+        <w:t xml:space="preserve"> There was very little difference in the confidence levels between the correct answers and the incorrect answers. This </w:t>
+      </w:r>
+      <w:r>
+        <w:rPr>
+          <w:lang w:val="en-US"/>
+        </w:rPr>
+        <w:lastRenderedPageBreak/>
+        <w:t xml:space="preserve">leads us to believe that the Large Language Model had no real idea if the information that it was presenting was correct or incorrect. It was blindly confident about </w:t>
       </w:r>
       <w:proofErr w:type="gramStart"/>
       <w:r>
@@ -2769,7 +2814,6 @@
         </w:rPr>
       </w:pPr>
       <w:r>
-        <w:lastRenderedPageBreak/>
         <w:t>MCQ Evaluation Summary</w:t>
       </w:r>
     </w:p>
@@ -4698,6 +4742,7 @@
     </w:p>
     <w:p>
       <w:r>
+        <w:lastRenderedPageBreak/>
         <w:t xml:space="preserve">Ironically, </w:t>
       </w:r>
       <w:r>
@@ -4731,7 +4776,6 @@
         <w:rPr>
           <w:lang w:val="en-US"/>
         </w:rPr>
-        <w:lastRenderedPageBreak/>
         <w:t>am-ET</w:t>
       </w:r>
     </w:p>
@@ -5889,6 +5933,7 @@
         <w:rPr>
           <w:lang w:val="en-US"/>
         </w:rPr>
+        <w:lastRenderedPageBreak/>
         <w:t xml:space="preserve">  </w:t>
       </w:r>
       <w:r>
@@ -5962,7 +6007,6 @@
         <w:rPr>
           <w:lang w:val="en-US"/>
         </w:rPr>
-        <w:lastRenderedPageBreak/>
         <w:t>A. chocolate paste</w:t>
       </w:r>
     </w:p>
@@ -6334,7 +6378,13 @@
         <w:rPr>
           <w:lang w:val="en-US"/>
         </w:rPr>
-        <w:t>The correct answer of “Bombing the giant squid” seems like a bizarre one to someone not familiar with Chinese culture, but this is in fact a popular street food vendor in China</w:t>
+        <w:t xml:space="preserve">The correct answer of “Bombing the giant squid” seems like a bizarre one to someone not familiar </w:t>
+      </w:r>
+      <w:r>
+        <w:rPr>
+          <w:lang w:val="en-US"/>
+        </w:rPr>
+        <w:t>with Chinese culture, but this is in fact a popular street food vendor in China</w:t>
       </w:r>
     </w:p>
     <w:p>
@@ -6382,13 +6432,7 @@
         <w:rPr>
           <w:lang w:val="en-US"/>
         </w:rPr>
-        <w:t xml:space="preserve">. Doing some basic googling, I can see that while potato fries are not an ancient, </w:t>
-      </w:r>
-      <w:r>
-        <w:rPr>
-          <w:lang w:val="en-US"/>
-        </w:rPr>
-        <w:t xml:space="preserve">traditional dish in </w:t>
+        <w:t xml:space="preserve">. Doing some basic googling, I can see that while potato fries are not an ancient, traditional dish in </w:t>
       </w:r>
       <w:r>
         <w:rPr>
@@ -6769,7 +6813,11 @@
     </w:p>
     <w:p>
       <w:r>
-        <w:t xml:space="preserve">Similarly, the macro-economics of the world have dictated that the majority of generative AI development work is being focused in the already over privileged parts of the world. What should we do with such advantage, those of us that are lucky enough to be a part of the new wave of development and professional interest of the </w:t>
+        <w:t xml:space="preserve">Similarly, the macro-economics of the world have dictated that the majority of generative AI development work is being focused in the already over privileged parts of the world. What should we </w:t>
+      </w:r>
+      <w:r>
+        <w:lastRenderedPageBreak/>
+        <w:t xml:space="preserve">do with such advantage, those of us that are lucky enough to be a part of the new wave of development and professional interest of the </w:t>
       </w:r>
       <w:proofErr w:type="gramStart"/>
       <w:r>
@@ -6782,11 +6830,7 @@
     </w:p>
     <w:p>
       <w:r>
-        <w:t xml:space="preserve">We have seen in some of the example answers from the project undertaken in this assignment, that western and more specifically American influences have already started to overwhelm </w:t>
-      </w:r>
-      <w:r>
-        <w:lastRenderedPageBreak/>
-        <w:t xml:space="preserve">under-resourced and under-represented cultures and traditions of areas where the global economy has not shined </w:t>
+        <w:t xml:space="preserve">We have seen in some of the example answers from the project undertaken in this assignment, that western and more specifically American influences have already started to overwhelm under-resourced and under-represented cultures and traditions of areas where the global economy has not shined </w:t>
       </w:r>
       <w:proofErr w:type="gramStart"/>
       <w:r>
@@ -7056,10 +7100,7 @@
     </w:p>
     <w:p>
       <w:r>
-        <w:t xml:space="preserve">The settings that I chose in practise reduced the amount of RAM that the GPU used to 16GB. I did not have the time to experiment with other </w:t>
-      </w:r>
-      <w:r>
-        <w:t>settings. It may we</w:t>
+        <w:t>The settings that I chose in practise reduced the amount of RAM that the GPU used to 16GB. I did not have the time to experiment with other settings. It may we</w:t>
       </w:r>
       <w:r>
         <w:t>l</w:t>
@@ -7142,7 +7183,7 @@
         </w:rPr>
         <w:t xml:space="preserve">[1] </w:t>
       </w:r>
-      <w:hyperlink r:id="rId13" w:history="1">
+      <w:hyperlink r:id="rId14" w:history="1">
         <w:r>
           <w:rPr>
             <w:rStyle w:val="Hyperlink"/>
@@ -7217,7 +7258,7 @@
         </w:rPr>
         <w:t xml:space="preserve">[3] </w:t>
       </w:r>
-      <w:hyperlink r:id="rId14" w:history="1">
+      <w:hyperlink r:id="rId15" w:history="1">
         <w:r>
           <w:rPr>
             <w:rStyle w:val="Hyperlink"/>
@@ -7248,7 +7289,7 @@
         </w:rPr>
         <w:t xml:space="preserve">[4] </w:t>
       </w:r>
-      <w:hyperlink r:id="rId15" w:history="1">
+      <w:hyperlink r:id="rId16" w:history="1">
         <w:r>
           <w:rPr>
             <w:rStyle w:val="Hyperlink"/>
@@ -7279,7 +7320,7 @@
         </w:rPr>
         <w:t xml:space="preserve">[5] </w:t>
       </w:r>
-      <w:hyperlink r:id="rId16" w:history="1">
+      <w:hyperlink r:id="rId17" w:history="1">
         <w:r>
           <w:rPr>
             <w:rStyle w:val="Hyperlink"/>
@@ -7304,7 +7345,7 @@
         </w:rPr>
         <w:t xml:space="preserve">[6] </w:t>
       </w:r>
-      <w:hyperlink r:id="rId17" w:anchor=":~:text=Logit,readily%20adapt%20to%20scenarios%20involving" w:history="1">
+      <w:hyperlink r:id="rId18" w:anchor=":~:text=Logit,readily%20adapt%20to%20scenarios%20involving" w:history="1">
         <w:r>
           <w:rPr>
             <w:rStyle w:val="Hyperlink"/>
@@ -7323,7 +7364,7 @@
       <w:r>
         <w:t xml:space="preserve">[7] </w:t>
       </w:r>
-      <w:hyperlink r:id="rId18" w:history="1">
+      <w:hyperlink r:id="rId19" w:history="1">
         <w:r>
           <w:rPr>
             <w:rStyle w:val="Hyperlink"/>
@@ -7339,7 +7380,7 @@
       <w:r>
         <w:t xml:space="preserve">[8] </w:t>
       </w:r>
-      <w:hyperlink r:id="rId19" w:history="1">
+      <w:hyperlink r:id="rId20" w:history="1">
         <w:r>
           <w:rPr>
             <w:rStyle w:val="Hyperlink"/>
@@ -7355,7 +7396,7 @@
       <w:r>
         <w:t xml:space="preserve">[9] </w:t>
       </w:r>
-      <w:hyperlink r:id="rId20" w:history="1">
+      <w:hyperlink r:id="rId21" w:history="1">
         <w:r>
           <w:rPr>
             <w:rStyle w:val="Hyperlink"/>
@@ -7371,7 +7412,7 @@
       <w:r>
         <w:t xml:space="preserve">[10] </w:t>
       </w:r>
-      <w:hyperlink r:id="rId21" w:history="1">
+      <w:hyperlink r:id="rId22" w:history="1">
         <w:r>
           <w:rPr>
             <w:rStyle w:val="Hyperlink"/>
@@ -12020,10 +12061,6 @@
 </file>
 
 <file path=customXml/item1.xml><?xml version="1.0" encoding="utf-8"?>
-<b:Sources xmlns:b="http://schemas.openxmlformats.org/officeDocument/2006/bibliography" xmlns="http://schemas.openxmlformats.org/officeDocument/2006/bibliography" SelectedStyle="\APASixthEditionOfficeOnline.xsl" StyleName="APA" Version="6"/>
-</file>
-
-<file path=customXml/item2.xml><?xml version="1.0" encoding="utf-8"?>
 <ct:contentTypeSchema xmlns:ct="http://schemas.microsoft.com/office/2006/metadata/contentType" xmlns:ma="http://schemas.microsoft.com/office/2006/metadata/properties/metaAttributes" ct:_="" ma:_="" ma:contentTypeName="Document" ma:contentTypeID="0x01010078195E5A655B1F419BEA189A3A95C299" ma:contentTypeVersion="10" ma:contentTypeDescription="Crée un document." ma:contentTypeScope="" ma:versionID="2565b4d261c143ebfe75fd259b6bcd59">
   <xsd:schema xmlns:xsd="http://www.w3.org/2001/XMLSchema" xmlns:xs="http://www.w3.org/2001/XMLSchema" xmlns:p="http://schemas.microsoft.com/office/2006/metadata/properties" xmlns:ns2="62f7326d-23c9-4c29-8c57-4f24d8722e7e" xmlns:ns3="22c202fc-011b-4e26-8c44-f2cfa4c279bc" targetNamespace="http://schemas.microsoft.com/office/2006/metadata/properties" ma:root="true" ma:fieldsID="d72157d5b0c62b9f9755a627728cfd03" ns2:_="" ns3:_="">
     <xsd:import namespace="62f7326d-23c9-4c29-8c57-4f24d8722e7e"/>
@@ -12212,16 +12249,11 @@
 </ct:contentTypeSchema>
 </file>
 
-<file path=customXml/item3.xml><?xml version="1.0" encoding="utf-8"?>
-<?mso-contentType ?>
-<FormTemplates xmlns="http://schemas.microsoft.com/sharepoint/v3/contenttype/forms">
-  <Display>DocumentLibraryForm</Display>
-  <Edit>DocumentLibraryForm</Edit>
-  <New>DocumentLibraryForm</New>
-</FormTemplates>
+<file path=customXml/item2.xml><?xml version="1.0" encoding="utf-8"?>
+<b:Sources xmlns:b="http://schemas.openxmlformats.org/officeDocument/2006/bibliography" xmlns="http://schemas.openxmlformats.org/officeDocument/2006/bibliography" SelectedStyle="\APASixthEditionOfficeOnline.xsl" StyleName="APA" Version="6"/>
 </file>
 
-<file path=customXml/item4.xml><?xml version="1.0" encoding="utf-8"?>
+<file path=customXml/item3.xml><?xml version="1.0" encoding="utf-8"?>
 <p:properties xmlns:p="http://schemas.microsoft.com/office/2006/metadata/properties" xmlns:xsi="http://www.w3.org/2001/XMLSchema-instance" xmlns:pc="http://schemas.microsoft.com/office/infopath/2007/PartnerControls">
   <documentManagement>
     <TaxCatchAll xmlns="22c202fc-011b-4e26-8c44-f2cfa4c279bc" xsi:nil="true"/>
@@ -12232,15 +12264,16 @@
 </p:properties>
 </file>
 
-<file path=customXml/itemProps1.xml><?xml version="1.0" encoding="utf-8"?>
-<ds:datastoreItem xmlns:ds="http://schemas.openxmlformats.org/officeDocument/2006/customXml" ds:itemID="{55619DD0-44FF-45CC-A1AA-11DEFCB71573}">
-  <ds:schemaRefs>
-    <ds:schemaRef ds:uri="http://schemas.openxmlformats.org/officeDocument/2006/bibliography"/>
-  </ds:schemaRefs>
-</ds:datastoreItem>
+<file path=customXml/item4.xml><?xml version="1.0" encoding="utf-8"?>
+<?mso-contentType ?>
+<FormTemplates xmlns="http://schemas.microsoft.com/sharepoint/v3/contenttype/forms">
+  <Display>DocumentLibraryForm</Display>
+  <Edit>DocumentLibraryForm</Edit>
+  <New>DocumentLibraryForm</New>
+</FormTemplates>
 </file>
 
-<file path=customXml/itemProps2.xml><?xml version="1.0" encoding="utf-8"?>
+<file path=customXml/itemProps1.xml><?xml version="1.0" encoding="utf-8"?>
 <ds:datastoreItem xmlns:ds="http://schemas.openxmlformats.org/officeDocument/2006/customXml" ds:itemID="{CF2E338C-B3A7-4820-B3AF-6468A979A60E}">
   <ds:schemaRefs>
     <ds:schemaRef ds:uri="http://schemas.microsoft.com/office/2006/metadata/contentType"/>
@@ -12259,15 +12292,15 @@
 </ds:datastoreItem>
 </file>
 
-<file path=customXml/itemProps3.xml><?xml version="1.0" encoding="utf-8"?>
-<ds:datastoreItem xmlns:ds="http://schemas.openxmlformats.org/officeDocument/2006/customXml" ds:itemID="{534D3452-20BD-4AA2-9FDF-9A4B15CAE6F5}">
+<file path=customXml/itemProps2.xml><?xml version="1.0" encoding="utf-8"?>
+<ds:datastoreItem xmlns:ds="http://schemas.openxmlformats.org/officeDocument/2006/customXml" ds:itemID="{55619DD0-44FF-45CC-A1AA-11DEFCB71573}">
   <ds:schemaRefs>
-    <ds:schemaRef ds:uri="http://schemas.microsoft.com/sharepoint/v3/contenttype/forms"/>
+    <ds:schemaRef ds:uri="http://schemas.openxmlformats.org/officeDocument/2006/bibliography"/>
   </ds:schemaRefs>
 </ds:datastoreItem>
 </file>
 
-<file path=customXml/itemProps4.xml><?xml version="1.0" encoding="utf-8"?>
+<file path=customXml/itemProps3.xml><?xml version="1.0" encoding="utf-8"?>
 <ds:datastoreItem xmlns:ds="http://schemas.openxmlformats.org/officeDocument/2006/customXml" ds:itemID="{D9C12D68-2805-4693-88ED-D456E27B80A9}">
   <ds:schemaRefs>
     <ds:schemaRef ds:uri="http://schemas.microsoft.com/office/2006/metadata/properties"/>
@@ -12276,4 +12309,12 @@
     <ds:schemaRef ds:uri="62f7326d-23c9-4c29-8c57-4f24d8722e7e"/>
   </ds:schemaRefs>
 </ds:datastoreItem>
+</file>
+
+<file path=customXml/itemProps4.xml><?xml version="1.0" encoding="utf-8"?>
+<ds:datastoreItem xmlns:ds="http://schemas.openxmlformats.org/officeDocument/2006/customXml" ds:itemID="{534D3452-20BD-4AA2-9FDF-9A4B15CAE6F5}">
+  <ds:schemaRefs>
+    <ds:schemaRef ds:uri="http://schemas.microsoft.com/sharepoint/v3/contenttype/forms"/>
+  </ds:schemaRefs>
+</ds:datastoreItem>
 </file>
</xml_diff>